<commit_message>
Atualiza o contato da Contratada e anota a conferência do CNPJ
Contato passa a ser ilhadosabor.sc@gmail.com e +55 (48) 99223-2826,
informados pela Contratante e mais atuais que os do cartão CNPJ.

O cartão reenviado é idêntico ao inicial: sede ainda no endereço do
empreendimento e CNAE principal 97.00-5-00. O checklist registra a
conferência para que os dois itens não sejam dados por resolvidos.

Co-Authored-By: Claude Opus 5 <noreply@anthropic.com>
Claude-Session: https://claude.ai/code/session_01JvuJwy7yY4EnoYMkQynCaG
</commit_message>
<xml_diff>
--- a/docs/juridico/checklist-regularizacao.docx
+++ b/docs/juridico/checklist-regularizacao.docx
@@ -434,6 +434,27 @@
           <w:b w:val="0"/>
         </w:rPr>
         <w:t xml:space="preserve"> (Junta Comercial de Santa Catarina) pelo Portal do Empreendedor ou pelo contador, com atualização automática no CNPJ. Prazo típico: 3 a 10 dias úteis.</w:t>
+      </w:r>
+    </w:p>
+    <w:p>
+      <w:pPr>
+        <w:ind w:left="454"/>
+      </w:pPr>
+      <w:r>
+        <w:rPr>
+          <w:b/>
+          <w:i/>
+          <w:sz w:val="19"/>
+        </w:rPr>
+        <w:t>Conferido em 05/09/2026:</w:t>
+      </w:r>
+      <w:r>
+        <w:rPr>
+          <w:b w:val="0"/>
+          <w:i/>
+          <w:sz w:val="19"/>
+        </w:rPr>
+        <w:t xml:space="preserve"> o cartão CNPJ emitido em 05/07/2026 continua com a sede na Estrada Manoel Leôncio de Souza Brito, 1475, e com o CNAE principal 97.00-5-00. Os itens 1 e 2 seguem pendentes.</w:t>
       </w:r>
     </w:p>
     <w:p>

</xml_diff>

<commit_message>
Reconhece a residência da Contratada na unidade cedida
A titular reside na Casa de Operações e é ali o endereço da sua empresa.
O contrato supunha o contrário em três pontos, e cláusula que contradiz
o fato enfraquece o documento inteiro.

- Qualificação passa a trazer o endereço real do CNPJ.
- Cláusula 4.4 deixa de exigir mudança de sede; permanecem a alteração
  do CNAE principal e a conta com chave PIX da empresa.
- Cláusula 9.3 deixa de vedar o uso do endereço como sede.
- Nova Cláusula 9.4 registra que residir e sediar a empresa na unidade
  decorre da natureza funcional da ocupação e da vigência do contrato, e
  não de direito próprio, obrigando à alteração do endereço no CNPJ no
  mesmo prazo de devolução da unidade.
- Itens seguintes da Cláusula 9 renumerados.
- Checklist reescreve o item 1 conforme a decisão.

Co-Authored-By: Claude Opus 5 <noreply@anthropic.com>
Claude-Session: https://claude.ai/code/session_01JvuJwy7yY4EnoYMkQynCaG
</commit_message>
<xml_diff>
--- a/docs/juridico/checklist-regularizacao.docx
+++ b/docs/juridico/checklist-regularizacao.docx
@@ -72,7 +72,7 @@
           <w:color w:val="C9A84C"/>
           <w:sz w:val="25"/>
         </w:rPr>
-        <w:t>1. Sede do CNPJ em endereço próprio</w:t>
+        <w:t>1. Endereço da sede — decisão tomada</w:t>
       </w:r>
     </w:p>
     <w:p>
@@ -80,13 +80,13 @@
         <w:rPr>
           <w:b/>
         </w:rPr>
-        <w:t>Situação atual:</w:t>
+        <w:t>Situação:</w:t>
       </w:r>
       <w:r>
         <w:rPr>
           <w:b w:val="0"/>
         </w:rPr>
-        <w:t xml:space="preserve"> o CNPJ 19.525.600/0001-00 está registrado na Estrada Manoel Leôncio de Souza Brito, 1475 — o mesmo endereço do empreendimento.</w:t>
+        <w:t xml:space="preserve"> o CNPJ 19.525.600/0001-00 está registrado na Estrada Manoel Leôncio de Souza Brito, 1475, que é a Casa de Operações onde a titular reside.</w:t>
       </w:r>
     </w:p>
     <w:p>
@@ -94,367 +94,39 @@
         <w:rPr>
           <w:b/>
         </w:rPr>
-        <w:t>O que fazer:</w:t>
+        <w:t>Decisão da Contratante:</w:t>
       </w:r>
       <w:r>
         <w:rPr>
           <w:b w:val="0"/>
         </w:rPr>
-        <w:t xml:space="preserve"> alterar o endereço da sede para um endereço distinto. Três caminhos possíveis:</w:t>
+        <w:t xml:space="preserve"> manter o endereço como está, uma vez que é de fato onde ela reside e onde a empresa opera.</w:t>
       </w:r>
     </w:p>
-    <w:tbl>
-      <w:tblPr>
-        <w:tblStyle w:val="TableGrid"/>
-        <w:tblW w:type="auto" w:w="0"/>
-        <w:jc w:val="center"/>
-        <w:tblLook w:firstColumn="1" w:firstRow="1" w:lastColumn="0" w:lastRow="0" w:noHBand="0" w:noVBand="1" w:val="04A0"/>
-      </w:tblPr>
-      <w:tblGrid>
-        <w:gridCol w:w="2929"/>
-        <w:gridCol w:w="2929"/>
-        <w:gridCol w:w="2929"/>
-      </w:tblGrid>
-      <w:tr>
-        <w:tc>
-          <w:tcPr>
-            <w:tcW w:type="dxa" w:w="2929"/>
-            <w:shd w:val="clear" w:fill="1C1C1C"/>
-          </w:tcPr>
-          <w:p>
-            <w:pPr>
-              <w:spacing w:after="40"/>
-              <w:jc w:val="left"/>
-            </w:pPr>
-            <w:r>
-              <w:rPr>
-                <w:color w:val="FFFFFF"/>
-                <w:sz w:val="18"/>
-              </w:rPr>
-            </w:r>
-            <w:r>
-              <w:rPr>
-                <w:b/>
-                <w:color w:val="FFFFFF"/>
-                <w:sz w:val="18"/>
-              </w:rPr>
-              <w:t>Opção</w:t>
-            </w:r>
-          </w:p>
-        </w:tc>
-        <w:tc>
-          <w:tcPr>
-            <w:tcW w:type="dxa" w:w="2929"/>
-            <w:shd w:val="clear" w:fill="1C1C1C"/>
-          </w:tcPr>
-          <w:p>
-            <w:pPr>
-              <w:spacing w:after="40"/>
-              <w:jc w:val="left"/>
-            </w:pPr>
-            <w:r>
-              <w:rPr>
-                <w:color w:val="FFFFFF"/>
-                <w:sz w:val="18"/>
-              </w:rPr>
-            </w:r>
-            <w:r>
-              <w:rPr>
-                <w:b/>
-                <w:color w:val="FFFFFF"/>
-                <w:sz w:val="18"/>
-              </w:rPr>
-              <w:t>Como funciona</w:t>
-            </w:r>
-          </w:p>
-        </w:tc>
-        <w:tc>
-          <w:tcPr>
-            <w:tcW w:type="dxa" w:w="2929"/>
-            <w:shd w:val="clear" w:fill="1C1C1C"/>
-          </w:tcPr>
-          <w:p>
-            <w:pPr>
-              <w:spacing w:after="40"/>
-              <w:jc w:val="left"/>
-            </w:pPr>
-            <w:r>
-              <w:rPr>
-                <w:color w:val="FFFFFF"/>
-                <w:sz w:val="18"/>
-              </w:rPr>
-            </w:r>
-            <w:r>
-              <w:rPr>
-                <w:b/>
-                <w:color w:val="FFFFFF"/>
-                <w:sz w:val="18"/>
-              </w:rPr>
-              <w:t>Custo aproximado</w:t>
-            </w:r>
-          </w:p>
-        </w:tc>
-      </w:tr>
-      <w:tr>
-        <w:tc>
-          <w:tcPr>
-            <w:tcW w:type="dxa" w:w="2929"/>
-          </w:tcPr>
-          <w:p>
-            <w:pPr>
-              <w:spacing w:after="40"/>
-              <w:jc w:val="left"/>
-            </w:pPr>
-            <w:r>
-              <w:rPr>
-                <w:sz w:val="18"/>
-              </w:rPr>
-            </w:r>
-            <w:r>
-              <w:rPr>
-                <w:b w:val="0"/>
-                <w:sz w:val="18"/>
-              </w:rPr>
-              <w:t>Endereço de familiar</w:t>
-            </w:r>
-          </w:p>
-        </w:tc>
-        <w:tc>
-          <w:tcPr>
-            <w:tcW w:type="dxa" w:w="2929"/>
-          </w:tcPr>
-          <w:p>
-            <w:pPr>
-              <w:spacing w:after="40"/>
-              <w:jc w:val="left"/>
-            </w:pPr>
-            <w:r>
-              <w:rPr>
-                <w:sz w:val="18"/>
-              </w:rPr>
-            </w:r>
-            <w:r>
-              <w:rPr>
-                <w:b w:val="0"/>
-                <w:sz w:val="18"/>
-              </w:rPr>
-              <w:t>Alteração cadastral simples, com comprovante de endereço e autorização do titular</w:t>
-            </w:r>
-          </w:p>
-        </w:tc>
-        <w:tc>
-          <w:tcPr>
-            <w:tcW w:type="dxa" w:w="2929"/>
-          </w:tcPr>
-          <w:p>
-            <w:pPr>
-              <w:spacing w:after="40"/>
-              <w:jc w:val="left"/>
-            </w:pPr>
-            <w:r>
-              <w:rPr>
-                <w:sz w:val="18"/>
-              </w:rPr>
-            </w:r>
-            <w:r>
-              <w:rPr>
-                <w:b w:val="0"/>
-                <w:sz w:val="18"/>
-              </w:rPr>
-              <w:t>Taxa da Junta Comercial</w:t>
-            </w:r>
-          </w:p>
-        </w:tc>
-      </w:tr>
-      <w:tr>
-        <w:tc>
-          <w:tcPr>
-            <w:tcW w:type="dxa" w:w="2929"/>
-          </w:tcPr>
-          <w:p>
-            <w:pPr>
-              <w:spacing w:after="40"/>
-              <w:jc w:val="left"/>
-            </w:pPr>
-            <w:r>
-              <w:rPr>
-                <w:sz w:val="18"/>
-              </w:rPr>
-            </w:r>
-            <w:r>
-              <w:rPr>
-                <w:b w:val="0"/>
-                <w:sz w:val="18"/>
-              </w:rPr>
-              <w:t>Endereço do escritório de contabilidade</w:t>
-            </w:r>
-          </w:p>
-        </w:tc>
-        <w:tc>
-          <w:tcPr>
-            <w:tcW w:type="dxa" w:w="2929"/>
-          </w:tcPr>
-          <w:p>
-            <w:pPr>
-              <w:spacing w:after="40"/>
-              <w:jc w:val="left"/>
-            </w:pPr>
-            <w:r>
-              <w:rPr>
-                <w:sz w:val="18"/>
-              </w:rPr>
-            </w:r>
-            <w:r>
-              <w:rPr>
-                <w:b w:val="0"/>
-                <w:sz w:val="18"/>
-              </w:rPr>
-              <w:t>Prática comum e legítima; o contador cede o endereço fiscal</w:t>
-            </w:r>
-          </w:p>
-        </w:tc>
-        <w:tc>
-          <w:tcPr>
-            <w:tcW w:type="dxa" w:w="2929"/>
-          </w:tcPr>
-          <w:p>
-            <w:pPr>
-              <w:spacing w:after="40"/>
-              <w:jc w:val="left"/>
-            </w:pPr>
-            <w:r>
-              <w:rPr>
-                <w:sz w:val="18"/>
-              </w:rPr>
-            </w:r>
-            <w:r>
-              <w:rPr>
-                <w:b w:val="0"/>
-                <w:sz w:val="18"/>
-              </w:rPr>
-              <w:t>Combinado com o contador</w:t>
-            </w:r>
-          </w:p>
-        </w:tc>
-      </w:tr>
-      <w:tr>
-        <w:tc>
-          <w:tcPr>
-            <w:tcW w:type="dxa" w:w="2929"/>
-          </w:tcPr>
-          <w:p>
-            <w:pPr>
-              <w:spacing w:after="40"/>
-              <w:jc w:val="left"/>
-            </w:pPr>
-            <w:r>
-              <w:rPr>
-                <w:sz w:val="18"/>
-              </w:rPr>
-            </w:r>
-            <w:r>
-              <w:rPr>
-                <w:b w:val="0"/>
-                <w:sz w:val="18"/>
-              </w:rPr>
-              <w:t>Escritório virtual</w:t>
-            </w:r>
-          </w:p>
-        </w:tc>
-        <w:tc>
-          <w:tcPr>
-            <w:tcW w:type="dxa" w:w="2929"/>
-          </w:tcPr>
-          <w:p>
-            <w:pPr>
-              <w:spacing w:after="40"/>
-              <w:jc w:val="left"/>
-            </w:pPr>
-            <w:r>
-              <w:rPr>
-                <w:sz w:val="18"/>
-              </w:rPr>
-            </w:r>
-            <w:r>
-              <w:rPr>
-                <w:b w:val="0"/>
-                <w:sz w:val="18"/>
-              </w:rPr>
-              <w:t>Empresa especializada fornece endereço fiscal e recebimento de correspondência</w:t>
-            </w:r>
-          </w:p>
-        </w:tc>
-        <w:tc>
-          <w:tcPr>
-            <w:tcW w:type="dxa" w:w="2929"/>
-          </w:tcPr>
-          <w:p>
-            <w:pPr>
-              <w:spacing w:after="40"/>
-              <w:jc w:val="left"/>
-            </w:pPr>
-            <w:r>
-              <w:rPr>
-                <w:sz w:val="18"/>
-              </w:rPr>
-            </w:r>
-            <w:r>
-              <w:rPr>
-                <w:b w:val="0"/>
-                <w:sz w:val="18"/>
-              </w:rPr>
-              <w:t>R$ 80 a R$ 150 por mês</w:t>
-            </w:r>
-          </w:p>
-        </w:tc>
-      </w:tr>
-    </w:tbl>
-    <w:p/>
     <w:p>
       <w:r>
         <w:rPr>
           <w:b/>
         </w:rPr>
-        <w:t>Como se faz:</w:t>
+        <w:t>Como o contrato trata:</w:t>
       </w:r>
       <w:r>
         <w:rPr>
           <w:b w:val="0"/>
         </w:rPr>
-        <w:t xml:space="preserve"> alteração do registro na </w:t>
+        <w:t xml:space="preserve"> a Cláusula 9.4 registra expressamente que a residência e o endereço da empresa na unidade decorrem da </w:t>
       </w:r>
       <w:r>
         <w:rPr>
           <w:b/>
         </w:rPr>
-        <w:t>JUCESC</w:t>
+        <w:t>natureza funcional da ocupação</w:t>
       </w:r>
       <w:r>
         <w:rPr>
           <w:b w:val="0"/>
         </w:rPr>
-        <w:t xml:space="preserve"> (Junta Comercial de Santa Catarina) pelo Portal do Empreendedor ou pelo contador, com atualização automática no CNPJ. Prazo típico: 3 a 10 dias úteis.</w:t>
-      </w:r>
-    </w:p>
-    <w:p>
-      <w:pPr>
-        <w:ind w:left="454"/>
-      </w:pPr>
-      <w:r>
-        <w:rPr>
-          <w:b/>
-          <w:i/>
-          <w:sz w:val="19"/>
-        </w:rPr>
-        <w:t>Conferido em 05/09/2026:</w:t>
-      </w:r>
-      <w:r>
-        <w:rPr>
-          <w:b w:val="0"/>
-          <w:i/>
-          <w:sz w:val="19"/>
-        </w:rPr>
-        <w:t xml:space="preserve"> o cartão CNPJ emitido em 05/07/2026 continua com a sede na Estrada Manoel Leôncio de Souza Brito, 1475, e com o CNAE principal 97.00-5-00. Os itens 1 e 2 seguem pendentes.</w:t>
+        <w:t xml:space="preserve"> e da vigência do contrato, e não de direito próprio sobre o imóvel. Encerrado o contrato, a Contratada fica obrigada a alterar o endereço do CNPJ no mesmo prazo de devolução da unidade.</w:t>
       </w:r>
     </w:p>
     <w:p>
@@ -466,39 +138,8 @@
         <w:rPr>
           <w:b w:val="0"/>
         </w:rPr>
-        <w:t>[ ] Endereço definido: ______________________________________________</w:t>
+        <w:t>[ ] Ciência da Contratada quanto à obrigação de alteração ao término do contrato</w:t>
       </w:r>
-    </w:p>
-    <w:p>
-      <w:pPr>
-        <w:pStyle w:val="ListBullet"/>
-        <w:spacing w:after="60"/>
-      </w:pPr>
-      <w:r>
-        <w:rPr>
-          <w:b w:val="0"/>
-        </w:rPr>
-        <w:t>[ ] Alteração protocolada na JUCESC em ___/___/______</w:t>
-      </w:r>
-    </w:p>
-    <w:p>
-      <w:pPr>
-        <w:pStyle w:val="ListBullet"/>
-        <w:spacing w:after="60"/>
-      </w:pPr>
-      <w:r>
-        <w:rPr>
-          <w:b w:val="0"/>
-        </w:rPr>
-        <w:t>[ ] Cartão CNPJ atualizado recebido</w:t>
-      </w:r>
-    </w:p>
-    <w:p>
-      <w:pPr>
-        <w:pBdr>
-          <w:bottom w:val="single" w:sz="6" w:color="C9A84C"/>
-        </w:pBdr>
-      </w:pPr>
     </w:p>
     <w:p>
       <w:pPr>
@@ -1903,18 +1544,6 @@
         <w:rPr>
           <w:b w:val="0"/>
         </w:rPr>
-        <w:t>[ ] Endereço da sede da Contratada, após o item 1</w:t>
-      </w:r>
-    </w:p>
-    <w:p>
-      <w:pPr>
-        <w:pStyle w:val="ListBullet"/>
-        <w:spacing w:after="60"/>
-      </w:pPr>
-      <w:r>
-        <w:rPr>
-          <w:b w:val="0"/>
-        </w:rPr>
         <w:t>[ ] Vistoria de entrada da Casa de Operações, com fotos datadas, assinada pelas duas Partes</w:t>
       </w:r>
     </w:p>

</xml_diff>